<commit_message>
Commit arquivo atualizado 17/05
</commit_message>
<xml_diff>
--- a/AutoPark System - Software Engineer_v5.docx
+++ b/AutoPark System - Software Engineer_v5.docx
@@ -1649,7 +1649,15 @@
           <w:sz w:val="20"/>
           <w:szCs w:val="20"/>
         </w:rPr>
-        <w:t>RF05: Permitir pagamento digital</w:t>
+        <w:t xml:space="preserve">RF05: </w:t>
+      </w:r>
+      <w:r>
+        <w:rPr>
+          <w:rFonts w:ascii="Arial" w:hAnsi="Arial" w:cs="Arial"/>
+          <w:sz w:val="20"/>
+          <w:szCs w:val="20"/>
+        </w:rPr>
+        <w:t>Realizar pagamentos</w:t>
       </w:r>
     </w:p>
     <w:p>
@@ -1693,7 +1701,15 @@
           <w:sz w:val="20"/>
           <w:szCs w:val="20"/>
         </w:rPr>
-        <w:t>RF07: Registro do veículo</w:t>
+        <w:t xml:space="preserve">RF07: </w:t>
+      </w:r>
+      <w:r>
+        <w:rPr>
+          <w:rFonts w:ascii="Arial" w:hAnsi="Arial" w:cs="Arial"/>
+          <w:sz w:val="20"/>
+          <w:szCs w:val="20"/>
+        </w:rPr>
+        <w:t>Gestão de vagas</w:t>
       </w:r>
     </w:p>
     <w:p>
@@ -1742,6 +1758,36 @@
     </w:p>
     <w:p>
       <w:pPr>
+        <w:pStyle w:val="NormalWeb"/>
+        <w:numPr>
+          <w:ilvl w:val="0"/>
+          <w:numId w:val="7"/>
+        </w:numPr>
+        <w:rPr>
+          <w:rFonts w:ascii="Arial" w:hAnsi="Arial" w:cs="Arial"/>
+          <w:sz w:val="20"/>
+          <w:szCs w:val="20"/>
+        </w:rPr>
+      </w:pPr>
+      <w:r>
+        <w:rPr>
+          <w:rFonts w:ascii="Arial" w:hAnsi="Arial" w:cs="Arial"/>
+          <w:sz w:val="20"/>
+          <w:szCs w:val="20"/>
+        </w:rPr>
+        <w:t>RF10: Registrar veícul</w:t>
+      </w:r>
+      <w:r>
+        <w:rPr>
+          <w:rFonts w:ascii="Arial" w:hAnsi="Arial" w:cs="Arial"/>
+          <w:sz w:val="20"/>
+          <w:szCs w:val="20"/>
+        </w:rPr>
+        <w:t>o</w:t>
+      </w:r>
+    </w:p>
+    <w:p>
+      <w:pPr>
         <w:pStyle w:val="Ttulo2"/>
         <w:rPr>
           <w:rFonts w:ascii="Arial" w:hAnsi="Arial" w:cs="Arial"/>
@@ -1750,16 +1796,8 @@
         </w:rPr>
       </w:pPr>
     </w:p>
-    <w:p>
-      <w:pPr>
-        <w:pStyle w:val="Ttulo2"/>
-        <w:rPr>
-          <w:rFonts w:ascii="Arial" w:hAnsi="Arial" w:cs="Arial"/>
-          <w:sz w:val="20"/>
-          <w:szCs w:val="20"/>
-        </w:rPr>
-      </w:pPr>
-    </w:p>
+    <w:p/>
+    <w:p/>
     <w:p>
       <w:pPr>
         <w:pStyle w:val="Ttulo2"/>
@@ -1775,6 +1813,7 @@
           <w:sz w:val="24"/>
           <w:szCs w:val="24"/>
         </w:rPr>
+        <w:lastRenderedPageBreak/>
         <w:t>Requisitos Não Funcionais (RNF)</w:t>
       </w:r>
     </w:p>
@@ -1815,7 +1854,6 @@
           <w:sz w:val="20"/>
           <w:szCs w:val="20"/>
         </w:rPr>
-        <w:lastRenderedPageBreak/>
         <w:t>RNF01: Sistema deve ter tempo de resposta ≤ 2 segundos</w:t>
       </w:r>
     </w:p>
@@ -1909,6 +1947,7 @@
     </w:p>
     <w:p>
       <w:pPr>
+        <w:pStyle w:val="NormalWeb"/>
         <w:rPr>
           <w:rFonts w:ascii="Arial" w:hAnsi="Arial" w:cs="Arial"/>
           <w:sz w:val="20"/>
@@ -2262,28 +2301,6 @@
         </w:rPr>
         <w:t>Projetos de integração de sistemas estão sujeitos ao surgimento de requisitos não previstos durante sua execução. Essas alterações podem afetar o cronograma e o orçamento, além de contribuir para uma maior resistência dos colaboradores na adoção do novo sistema.</w:t>
       </w:r>
-    </w:p>
-    <w:p>
-      <w:pPr>
-        <w:spacing w:after="0"/>
-        <w:jc w:val="both"/>
-        <w:rPr>
-          <w:rFonts w:ascii="Arial" w:hAnsi="Arial" w:cs="Arial"/>
-          <w:sz w:val="20"/>
-          <w:szCs w:val="20"/>
-        </w:rPr>
-      </w:pPr>
-    </w:p>
-    <w:p>
-      <w:pPr>
-        <w:spacing w:after="0"/>
-        <w:jc w:val="both"/>
-        <w:rPr>
-          <w:rFonts w:ascii="Arial" w:hAnsi="Arial" w:cs="Arial"/>
-          <w:sz w:val="20"/>
-          <w:szCs w:val="20"/>
-        </w:rPr>
-      </w:pPr>
     </w:p>
     <w:p>
       <w:pPr>
@@ -2889,7 +2906,6 @@
           <w:sz w:val="24"/>
           <w:szCs w:val="24"/>
         </w:rPr>
-        <w:lastRenderedPageBreak/>
         <w:t>9. Cronograma</w:t>
       </w:r>
     </w:p>
@@ -3922,10 +3938,10 @@
           <w:noProof/>
         </w:rPr>
         <w:drawing>
-          <wp:inline distT="0" distB="0" distL="0" distR="0" wp14:anchorId="3DE9CBC7" wp14:editId="5CBEAF6E">
-            <wp:extent cx="5400040" cy="3351530"/>
-            <wp:effectExtent l="0" t="0" r="0" b="1270"/>
-            <wp:docPr id="1868350505" name="Imagem 1"/>
+          <wp:inline distT="0" distB="0" distL="0" distR="0" wp14:anchorId="08A8702F" wp14:editId="1F36FD44">
+            <wp:extent cx="5400040" cy="2863970"/>
+            <wp:effectExtent l="0" t="0" r="0" b="3810"/>
+            <wp:docPr id="1602704768" name="Imagem 2"/>
             <wp:cNvGraphicFramePr>
               <a:graphicFrameLocks xmlns:a="http://schemas.openxmlformats.org/drawingml/2006/main" noChangeAspect="1"/>
             </wp:cNvGraphicFramePr>
@@ -3933,7 +3949,7 @@
               <a:graphicData uri="http://schemas.openxmlformats.org/drawingml/2006/picture">
                 <pic:pic xmlns:pic="http://schemas.openxmlformats.org/drawingml/2006/picture">
                   <pic:nvPicPr>
-                    <pic:cNvPr id="1868350505" name="Imagem 1868350505"/>
+                    <pic:cNvPr id="1602704768" name="Imagem 1602704768"/>
                     <pic:cNvPicPr/>
                   </pic:nvPicPr>
                   <pic:blipFill>
@@ -3951,7 +3967,7 @@
                   <pic:spPr>
                     <a:xfrm>
                       <a:off x="0" y="0"/>
-                      <a:ext cx="5400040" cy="3351530"/>
+                      <a:ext cx="5400040" cy="2863970"/>
                     </a:xfrm>
                     <a:prstGeom prst="rect">
                       <a:avLst/>
@@ -3965,6 +3981,239 @@
       </w:r>
     </w:p>
     <w:p>
+      <w:r>
+        <w:rPr>
+          <w:noProof/>
+        </w:rPr>
+        <w:drawing>
+          <wp:inline distT="0" distB="0" distL="0" distR="0" wp14:anchorId="0F862DF1" wp14:editId="099EBCB2">
+            <wp:extent cx="5400040" cy="2829464"/>
+            <wp:effectExtent l="0" t="0" r="0" b="9525"/>
+            <wp:docPr id="1679796379" name="Imagem 3"/>
+            <wp:cNvGraphicFramePr>
+              <a:graphicFrameLocks xmlns:a="http://schemas.openxmlformats.org/drawingml/2006/main" noChangeAspect="1"/>
+            </wp:cNvGraphicFramePr>
+            <a:graphic xmlns:a="http://schemas.openxmlformats.org/drawingml/2006/main">
+              <a:graphicData uri="http://schemas.openxmlformats.org/drawingml/2006/picture">
+                <pic:pic xmlns:pic="http://schemas.openxmlformats.org/drawingml/2006/picture">
+                  <pic:nvPicPr>
+                    <pic:cNvPr id="1679796379" name="Imagem 1679796379"/>
+                    <pic:cNvPicPr/>
+                  </pic:nvPicPr>
+                  <pic:blipFill>
+                    <a:blip r:embed="rId8">
+                      <a:extLst>
+                        <a:ext uri="{28A0092B-C50C-407E-A947-70E740481C1C}">
+                          <a14:useLocalDpi xmlns:a14="http://schemas.microsoft.com/office/drawing/2010/main" val="0"/>
+                        </a:ext>
+                      </a:extLst>
+                    </a:blip>
+                    <a:stretch>
+                      <a:fillRect/>
+                    </a:stretch>
+                  </pic:blipFill>
+                  <pic:spPr>
+                    <a:xfrm>
+                      <a:off x="0" y="0"/>
+                      <a:ext cx="5400040" cy="2829464"/>
+                    </a:xfrm>
+                    <a:prstGeom prst="rect">
+                      <a:avLst/>
+                    </a:prstGeom>
+                  </pic:spPr>
+                </pic:pic>
+              </a:graphicData>
+            </a:graphic>
+          </wp:inline>
+        </w:drawing>
+      </w:r>
+      <w:r>
+        <w:rPr>
+          <w:noProof/>
+        </w:rPr>
+        <w:drawing>
+          <wp:inline distT="0" distB="0" distL="0" distR="0" wp14:anchorId="47490B20" wp14:editId="3F6D814E">
+            <wp:extent cx="5400040" cy="2829465"/>
+            <wp:effectExtent l="0" t="0" r="0" b="9525"/>
+            <wp:docPr id="1592944465" name="Imagem 4"/>
+            <wp:cNvGraphicFramePr>
+              <a:graphicFrameLocks xmlns:a="http://schemas.openxmlformats.org/drawingml/2006/main" noChangeAspect="1"/>
+            </wp:cNvGraphicFramePr>
+            <a:graphic xmlns:a="http://schemas.openxmlformats.org/drawingml/2006/main">
+              <a:graphicData uri="http://schemas.openxmlformats.org/drawingml/2006/picture">
+                <pic:pic xmlns:pic="http://schemas.openxmlformats.org/drawingml/2006/picture">
+                  <pic:nvPicPr>
+                    <pic:cNvPr id="1592944465" name="Imagem 1592944465"/>
+                    <pic:cNvPicPr/>
+                  </pic:nvPicPr>
+                  <pic:blipFill>
+                    <a:blip r:embed="rId9">
+                      <a:extLst>
+                        <a:ext uri="{28A0092B-C50C-407E-A947-70E740481C1C}">
+                          <a14:useLocalDpi xmlns:a14="http://schemas.microsoft.com/office/drawing/2010/main" val="0"/>
+                        </a:ext>
+                      </a:extLst>
+                    </a:blip>
+                    <a:stretch>
+                      <a:fillRect/>
+                    </a:stretch>
+                  </pic:blipFill>
+                  <pic:spPr>
+                    <a:xfrm>
+                      <a:off x="0" y="0"/>
+                      <a:ext cx="5400040" cy="2829465"/>
+                    </a:xfrm>
+                    <a:prstGeom prst="rect">
+                      <a:avLst/>
+                    </a:prstGeom>
+                  </pic:spPr>
+                </pic:pic>
+              </a:graphicData>
+            </a:graphic>
+          </wp:inline>
+        </w:drawing>
+      </w:r>
+      <w:r>
+        <w:rPr>
+          <w:noProof/>
+        </w:rPr>
+        <w:lastRenderedPageBreak/>
+        <w:drawing>
+          <wp:inline distT="0" distB="0" distL="0" distR="0" wp14:anchorId="53384701" wp14:editId="7B483442">
+            <wp:extent cx="5400040" cy="3007360"/>
+            <wp:effectExtent l="0" t="0" r="0" b="2540"/>
+            <wp:docPr id="1808917346" name="Imagem 5"/>
+            <wp:cNvGraphicFramePr>
+              <a:graphicFrameLocks xmlns:a="http://schemas.openxmlformats.org/drawingml/2006/main" noChangeAspect="1"/>
+            </wp:cNvGraphicFramePr>
+            <a:graphic xmlns:a="http://schemas.openxmlformats.org/drawingml/2006/main">
+              <a:graphicData uri="http://schemas.openxmlformats.org/drawingml/2006/picture">
+                <pic:pic xmlns:pic="http://schemas.openxmlformats.org/drawingml/2006/picture">
+                  <pic:nvPicPr>
+                    <pic:cNvPr id="1808917346" name="Imagem 1808917346"/>
+                    <pic:cNvPicPr/>
+                  </pic:nvPicPr>
+                  <pic:blipFill>
+                    <a:blip r:embed="rId10">
+                      <a:extLst>
+                        <a:ext uri="{28A0092B-C50C-407E-A947-70E740481C1C}">
+                          <a14:useLocalDpi xmlns:a14="http://schemas.microsoft.com/office/drawing/2010/main" val="0"/>
+                        </a:ext>
+                      </a:extLst>
+                    </a:blip>
+                    <a:stretch>
+                      <a:fillRect/>
+                    </a:stretch>
+                  </pic:blipFill>
+                  <pic:spPr>
+                    <a:xfrm>
+                      <a:off x="0" y="0"/>
+                      <a:ext cx="5400040" cy="3007360"/>
+                    </a:xfrm>
+                    <a:prstGeom prst="rect">
+                      <a:avLst/>
+                    </a:prstGeom>
+                  </pic:spPr>
+                </pic:pic>
+              </a:graphicData>
+            </a:graphic>
+          </wp:inline>
+        </w:drawing>
+      </w:r>
+      <w:r>
+        <w:rPr>
+          <w:noProof/>
+        </w:rPr>
+        <w:drawing>
+          <wp:inline distT="0" distB="0" distL="0" distR="0" wp14:anchorId="536BA42F" wp14:editId="3FA49ABD">
+            <wp:extent cx="5400040" cy="3039110"/>
+            <wp:effectExtent l="0" t="0" r="0" b="8890"/>
+            <wp:docPr id="898132143" name="Imagem 6"/>
+            <wp:cNvGraphicFramePr>
+              <a:graphicFrameLocks xmlns:a="http://schemas.openxmlformats.org/drawingml/2006/main" noChangeAspect="1"/>
+            </wp:cNvGraphicFramePr>
+            <a:graphic xmlns:a="http://schemas.openxmlformats.org/drawingml/2006/main">
+              <a:graphicData uri="http://schemas.openxmlformats.org/drawingml/2006/picture">
+                <pic:pic xmlns:pic="http://schemas.openxmlformats.org/drawingml/2006/picture">
+                  <pic:nvPicPr>
+                    <pic:cNvPr id="898132143" name="Imagem 898132143"/>
+                    <pic:cNvPicPr/>
+                  </pic:nvPicPr>
+                  <pic:blipFill>
+                    <a:blip r:embed="rId11">
+                      <a:extLst>
+                        <a:ext uri="{28A0092B-C50C-407E-A947-70E740481C1C}">
+                          <a14:useLocalDpi xmlns:a14="http://schemas.microsoft.com/office/drawing/2010/main" val="0"/>
+                        </a:ext>
+                      </a:extLst>
+                    </a:blip>
+                    <a:stretch>
+                      <a:fillRect/>
+                    </a:stretch>
+                  </pic:blipFill>
+                  <pic:spPr>
+                    <a:xfrm>
+                      <a:off x="0" y="0"/>
+                      <a:ext cx="5400040" cy="3039110"/>
+                    </a:xfrm>
+                    <a:prstGeom prst="rect">
+                      <a:avLst/>
+                    </a:prstGeom>
+                  </pic:spPr>
+                </pic:pic>
+              </a:graphicData>
+            </a:graphic>
+          </wp:inline>
+        </w:drawing>
+      </w:r>
+      <w:r>
+        <w:rPr>
+          <w:noProof/>
+        </w:rPr>
+        <w:drawing>
+          <wp:inline distT="0" distB="0" distL="0" distR="0" wp14:anchorId="7E7D8EE5" wp14:editId="28D10A0C">
+            <wp:extent cx="5400040" cy="2992755"/>
+            <wp:effectExtent l="0" t="0" r="0" b="0"/>
+            <wp:docPr id="385777296" name="Imagem 7"/>
+            <wp:cNvGraphicFramePr>
+              <a:graphicFrameLocks xmlns:a="http://schemas.openxmlformats.org/drawingml/2006/main" noChangeAspect="1"/>
+            </wp:cNvGraphicFramePr>
+            <a:graphic xmlns:a="http://schemas.openxmlformats.org/drawingml/2006/main">
+              <a:graphicData uri="http://schemas.openxmlformats.org/drawingml/2006/picture">
+                <pic:pic xmlns:pic="http://schemas.openxmlformats.org/drawingml/2006/picture">
+                  <pic:nvPicPr>
+                    <pic:cNvPr id="385777296" name="Imagem 385777296"/>
+                    <pic:cNvPicPr/>
+                  </pic:nvPicPr>
+                  <pic:blipFill>
+                    <a:blip r:embed="rId12">
+                      <a:extLst>
+                        <a:ext uri="{28A0092B-C50C-407E-A947-70E740481C1C}">
+                          <a14:useLocalDpi xmlns:a14="http://schemas.microsoft.com/office/drawing/2010/main" val="0"/>
+                        </a:ext>
+                      </a:extLst>
+                    </a:blip>
+                    <a:stretch>
+                      <a:fillRect/>
+                    </a:stretch>
+                  </pic:blipFill>
+                  <pic:spPr>
+                    <a:xfrm>
+                      <a:off x="0" y="0"/>
+                      <a:ext cx="5400040" cy="2992755"/>
+                    </a:xfrm>
+                    <a:prstGeom prst="rect">
+                      <a:avLst/>
+                    </a:prstGeom>
+                  </pic:spPr>
+                </pic:pic>
+              </a:graphicData>
+            </a:graphic>
+          </wp:inline>
+        </w:drawing>
+      </w:r>
+    </w:p>
+    <w:p>
       <w:pPr>
         <w:pStyle w:val="Ttulo1"/>
         <w:rPr>
@@ -3981,6 +4230,7 @@
           <w:sz w:val="24"/>
           <w:szCs w:val="24"/>
         </w:rPr>
+        <w:lastRenderedPageBreak/>
         <w:t>12</w:t>
       </w:r>
       <w:r>
@@ -4003,6 +4253,54 @@
       </w:r>
     </w:p>
     <w:p>
+      <w:r>
+        <w:rPr>
+          <w:noProof/>
+        </w:rPr>
+        <w:drawing>
+          <wp:inline distT="0" distB="0" distL="0" distR="0" wp14:anchorId="7DB03405" wp14:editId="4F959639">
+            <wp:extent cx="5400040" cy="5343525"/>
+            <wp:effectExtent l="0" t="0" r="0" b="9525"/>
+            <wp:docPr id="483971364" name="Imagem 1"/>
+            <wp:cNvGraphicFramePr>
+              <a:graphicFrameLocks xmlns:a="http://schemas.openxmlformats.org/drawingml/2006/main" noChangeAspect="1"/>
+            </wp:cNvGraphicFramePr>
+            <a:graphic xmlns:a="http://schemas.openxmlformats.org/drawingml/2006/main">
+              <a:graphicData uri="http://schemas.openxmlformats.org/drawingml/2006/picture">
+                <pic:pic xmlns:pic="http://schemas.openxmlformats.org/drawingml/2006/picture">
+                  <pic:nvPicPr>
+                    <pic:cNvPr id="483971364" name="Imagem 483971364"/>
+                    <pic:cNvPicPr/>
+                  </pic:nvPicPr>
+                  <pic:blipFill>
+                    <a:blip r:embed="rId13">
+                      <a:extLst>
+                        <a:ext uri="{28A0092B-C50C-407E-A947-70E740481C1C}">
+                          <a14:useLocalDpi xmlns:a14="http://schemas.microsoft.com/office/drawing/2010/main" val="0"/>
+                        </a:ext>
+                      </a:extLst>
+                    </a:blip>
+                    <a:stretch>
+                      <a:fillRect/>
+                    </a:stretch>
+                  </pic:blipFill>
+                  <pic:spPr>
+                    <a:xfrm>
+                      <a:off x="0" y="0"/>
+                      <a:ext cx="5400040" cy="5343525"/>
+                    </a:xfrm>
+                    <a:prstGeom prst="rect">
+                      <a:avLst/>
+                    </a:prstGeom>
+                  </pic:spPr>
+                </pic:pic>
+              </a:graphicData>
+            </a:graphic>
+          </wp:inline>
+        </w:drawing>
+      </w:r>
+    </w:p>
+    <w:p>
       <w:pPr>
         <w:pStyle w:val="Ttulo1"/>
         <w:rPr>
@@ -4019,6 +4317,7 @@
           <w:sz w:val="24"/>
           <w:szCs w:val="24"/>
         </w:rPr>
+        <w:lastRenderedPageBreak/>
         <w:t>13</w:t>
       </w:r>
       <w:r>
@@ -4046,7 +4345,7 @@
           <w:noProof/>
         </w:rPr>
         <w:drawing>
-          <wp:inline distT="0" distB="0" distL="0" distR="0" wp14:anchorId="6B149395" wp14:editId="3ED5E991">
+          <wp:inline distT="0" distB="0" distL="0" distR="0" wp14:anchorId="6B149395" wp14:editId="4E47FF27">
             <wp:extent cx="5400040" cy="4276725"/>
             <wp:effectExtent l="0" t="0" r="0" b="9525"/>
             <wp:docPr id="1050915226" name="Imagem 1"/>
@@ -4061,7 +4360,7 @@
                     <pic:cNvPicPr/>
                   </pic:nvPicPr>
                   <pic:blipFill>
-                    <a:blip r:embed="rId8" cstate="print">
+                    <a:blip r:embed="rId14" cstate="print">
                       <a:extLst>
                         <a:ext uri="{28A0092B-C50C-407E-A947-70E740481C1C}">
                           <a14:useLocalDpi xmlns:a14="http://schemas.microsoft.com/office/drawing/2010/main" val="0"/>
@@ -4105,7 +4404,6 @@
           <w:sz w:val="24"/>
           <w:szCs w:val="24"/>
         </w:rPr>
-        <w:lastRenderedPageBreak/>
         <w:t>14</w:t>
       </w:r>
       <w:r>
@@ -4134,10 +4432,13 @@
     </w:p>
     <w:p>
       <w:r>
+        <w:rPr>
+          <w:noProof/>
+        </w:rPr>
         <w:drawing>
-          <wp:inline distT="0" distB="0" distL="0" distR="0" wp14:anchorId="1BB8C5B9" wp14:editId="6FEC2457">
-            <wp:extent cx="2638425" cy="4189862"/>
-            <wp:effectExtent l="0" t="0" r="0" b="1270"/>
+          <wp:inline distT="0" distB="0" distL="0" distR="0" wp14:anchorId="1BB8C5B9" wp14:editId="3A702DF2">
+            <wp:extent cx="2637790" cy="4132052"/>
+            <wp:effectExtent l="0" t="0" r="0" b="1905"/>
             <wp:docPr id="419261594" name="Imagem 1"/>
             <wp:cNvGraphicFramePr>
               <a:graphicFrameLocks xmlns:a="http://schemas.openxmlformats.org/drawingml/2006/main" noChangeAspect="1"/>
@@ -4150,7 +4451,7 @@
                     <pic:cNvPicPr/>
                   </pic:nvPicPr>
                   <pic:blipFill>
-                    <a:blip r:embed="rId9"/>
+                    <a:blip r:embed="rId15"/>
                     <a:stretch>
                       <a:fillRect/>
                     </a:stretch>
@@ -4158,7 +4459,7 @@
                   <pic:spPr>
                     <a:xfrm>
                       <a:off x="0" y="0"/>
-                      <a:ext cx="2640175" cy="4192641"/>
+                      <a:ext cx="2652252" cy="4154707"/>
                     </a:xfrm>
                     <a:prstGeom prst="rect">
                       <a:avLst/>
@@ -4173,11 +4474,15 @@
     </w:p>
     <w:p>
       <w:r>
+        <w:lastRenderedPageBreak/>
         <w:t>Tela de Login</w:t>
       </w:r>
     </w:p>
     <w:p>
       <w:r>
+        <w:rPr>
+          <w:noProof/>
+        </w:rPr>
         <w:drawing>
           <wp:inline distT="0" distB="0" distL="0" distR="0" wp14:anchorId="1DC45AD1" wp14:editId="7D460CF2">
             <wp:extent cx="2675890" cy="4148919"/>
@@ -4194,7 +4499,7 @@
                     <pic:cNvPicPr/>
                   </pic:nvPicPr>
                   <pic:blipFill>
-                    <a:blip r:embed="rId10"/>
+                    <a:blip r:embed="rId16"/>
                     <a:stretch>
                       <a:fillRect/>
                     </a:stretch>
@@ -4223,6 +4528,9 @@
     </w:p>
     <w:p>
       <w:r>
+        <w:rPr>
+          <w:noProof/>
+        </w:rPr>
         <w:drawing>
           <wp:inline distT="0" distB="0" distL="0" distR="0" wp14:anchorId="4E632713" wp14:editId="0FAFB5FB">
             <wp:extent cx="2657475" cy="4189862"/>
@@ -4239,7 +4547,7 @@
                     <pic:cNvPicPr/>
                   </pic:nvPicPr>
                   <pic:blipFill>
-                    <a:blip r:embed="rId11"/>
+                    <a:blip r:embed="rId17"/>
                     <a:stretch>
                       <a:fillRect/>
                     </a:stretch>
@@ -4262,11 +4570,15 @@
     </w:p>
     <w:p>
       <w:r>
+        <w:lastRenderedPageBreak/>
         <w:t>Tela de Veículos</w:t>
       </w:r>
     </w:p>
     <w:p>
       <w:r>
+        <w:rPr>
+          <w:noProof/>
+        </w:rPr>
         <w:drawing>
           <wp:inline distT="0" distB="0" distL="0" distR="0" wp14:anchorId="4262A0F7" wp14:editId="7BE6CCC8">
             <wp:extent cx="2656205" cy="4217159"/>
@@ -4283,7 +4595,7 @@
                     <pic:cNvPicPr/>
                   </pic:nvPicPr>
                   <pic:blipFill>
-                    <a:blip r:embed="rId12"/>
+                    <a:blip r:embed="rId18"/>
                     <a:stretch>
                       <a:fillRect/>
                     </a:stretch>
@@ -4306,12 +4618,14 @@
     </w:p>
     <w:p>
       <w:r>
-        <w:lastRenderedPageBreak/>
         <w:t>Tela de Informações Sobre Veículo</w:t>
       </w:r>
     </w:p>
     <w:p>
       <w:r>
+        <w:rPr>
+          <w:noProof/>
+        </w:rPr>
         <w:drawing>
           <wp:inline distT="0" distB="0" distL="0" distR="0" wp14:anchorId="6DEE2AD3" wp14:editId="55536D10">
             <wp:extent cx="2676296" cy="4135272"/>
@@ -4328,7 +4642,7 @@
                     <pic:cNvPicPr/>
                   </pic:nvPicPr>
                   <pic:blipFill>
-                    <a:blip r:embed="rId13"/>
+                    <a:blip r:embed="rId19"/>
                     <a:stretch>
                       <a:fillRect/>
                     </a:stretch>
@@ -4349,13 +4663,18 @@
         </w:drawing>
       </w:r>
     </w:p>
-    <w:p>
-      <w:r>
+    <w:p/>
+    <w:p>
+      <w:r>
+        <w:lastRenderedPageBreak/>
         <w:t>Tela de Suporte</w:t>
       </w:r>
     </w:p>
     <w:p>
       <w:r>
+        <w:rPr>
+          <w:noProof/>
+        </w:rPr>
         <w:drawing>
           <wp:inline distT="0" distB="0" distL="0" distR="0" wp14:anchorId="45CD693E" wp14:editId="063B0351">
             <wp:extent cx="2676525" cy="4435522"/>
@@ -4372,7 +4691,7 @@
                     <pic:cNvPicPr/>
                   </pic:nvPicPr>
                   <pic:blipFill>
-                    <a:blip r:embed="rId14"/>
+                    <a:blip r:embed="rId20"/>
                     <a:stretch>
                       <a:fillRect/>
                     </a:stretch>
@@ -4395,16 +4714,18 @@
     </w:p>
     <w:p>
       <w:r>
-        <w:lastRenderedPageBreak/>
         <w:t>Tela de Pagamento</w:t>
       </w:r>
     </w:p>
     <w:p>
       <w:r>
+        <w:rPr>
+          <w:noProof/>
+        </w:rPr>
         <w:drawing>
-          <wp:inline distT="0" distB="0" distL="0" distR="0" wp14:anchorId="3A3AC782" wp14:editId="7C049798">
-            <wp:extent cx="2676899" cy="5010849"/>
-            <wp:effectExtent l="0" t="0" r="9525" b="0"/>
+          <wp:inline distT="0" distB="0" distL="0" distR="0" wp14:anchorId="3A3AC782" wp14:editId="5850878B">
+            <wp:extent cx="2676484" cy="4304582"/>
+            <wp:effectExtent l="0" t="0" r="0" b="1270"/>
             <wp:docPr id="956297316" name="Imagem 1"/>
             <wp:cNvGraphicFramePr>
               <a:graphicFrameLocks xmlns:a="http://schemas.openxmlformats.org/drawingml/2006/main" noChangeAspect="1"/>
@@ -4417,7 +4738,7 @@
                     <pic:cNvPicPr/>
                   </pic:nvPicPr>
                   <pic:blipFill>
-                    <a:blip r:embed="rId15"/>
+                    <a:blip r:embed="rId21"/>
                     <a:stretch>
                       <a:fillRect/>
                     </a:stretch>
@@ -4425,7 +4746,7 @@
                   <pic:spPr>
                     <a:xfrm>
                       <a:off x="0" y="0"/>
-                      <a:ext cx="2676899" cy="5010849"/>
+                      <a:ext cx="2681928" cy="4313338"/>
                     </a:xfrm>
                     <a:prstGeom prst="rect">
                       <a:avLst/>

</xml_diff>